<commit_message>
docs: update requirements v1.1 and SDD v0.2 with Day 3 client decisions
- requirements.md: close OQ-01 to OQ-04 with Oct 14 client answers
- requirements.md: update FLT-03 default date range (last 7 days, UTC)
- requirements.md: mark D-02 as temporary deviation (country view coming with live Snowflake)
- requirements.md: update data facts note (SQLite US-only, Snowflake multi-country)
- requirements.md: mark CON-01, CON-02, CON-03 Done
- sdd.md / sdd.docx: remove Section 7 assumptions/risks (lives in requirements.md)
- sdd.md / sdd.docx: renumber to 7 sections, bump to v0.2
- sdd.md / sdd.docx: update next steps to 2 items (export, AI chatbot)
- sdd.md: replace Mermaid diagram with architecture.png
- sdd.docx: sync plain-words steps and next steps to match sdd.md
</commit_message>
<xml_diff>
--- a/docs/sdd.docx
+++ b/docs/sdd.docx
@@ -135,7 +135,7 @@
                 <w:rFonts w:ascii="Arial" w:hAnsi="Arial" w:eastAsia="Arial"/>
                 <w:sz w:val="20"/>
               </w:rPr>
-              <w:t xml:space="preserve">0.1 (draft)</w:t>
+              <w:t xml:space="preserve">0.2 (draft)</w:t>
             </w:r>
           </w:p>
         </w:tc>
@@ -169,7 +169,7 @@
                 <w:rFonts w:ascii="Arial" w:hAnsi="Arial" w:eastAsia="Arial"/>
                 <w:sz w:val="20"/>
               </w:rPr>
-              <w:t xml:space="preserve">October 2026</w:t>
+              <w:t xml:space="preserve">October 14, 2026</w:t>
             </w:r>
           </w:p>
         </w:tc>
@@ -482,7 +482,7 @@
           <w:rFonts w:ascii="Arial" w:hAnsi="Arial" w:eastAsia="Arial"/>
           <w:sz w:val="21"/>
         </w:rPr>
-        <w:t xml:space="preserve">Out of scope: changing any data (the dashboard is read-only), forecasting, and user-specific permissions. These appear under next steps.</w:t>
+        <w:t xml:space="preserve">Out of scope: changing any data (the dashboard is read-only), forecasting, and user-specific permissions.</w:t>
       </w:r>
     </w:p>
     <w:p>
@@ -583,7 +583,7 @@
           <w:rFonts w:ascii="Arial" w:hAnsi="Arial" w:eastAsia="Arial"/>
           <w:sz w:val="21"/>
         </w:rPr>
-        <w:t xml:space="preserve">The manager opens the dashboard and signs in with their Snowflake account.</w:t>
+        <w:t xml:space="preserve">1. The manager opens the dashboard in their browser and signs in with their Snowflake account.</w:t>
       </w:r>
     </w:p>
     <w:p>
@@ -599,7 +599,7 @@
           <w:rFonts w:ascii="Arial" w:hAnsi="Arial" w:eastAsia="Arial"/>
           <w:sz w:val="21"/>
         </w:rPr>
-        <w:t xml:space="preserve">The router delivers the screens.</w:t>
+        <w:t xml:space="preserve">2. The router delivers the React screens to the browser.</w:t>
       </w:r>
     </w:p>
     <w:p>
@@ -615,7 +615,7 @@
           <w:rFonts w:ascii="Arial" w:hAnsi="Arial" w:eastAsia="Arial"/>
           <w:sz w:val="21"/>
         </w:rPr>
-        <w:t xml:space="preserve">When the manager picks dates, the screens ask the data service for the numbers.</w:t>
+        <w:t>3. When the manager picks a date range and clicks Apply, the screens ask the data service for the numbers, through the router.</w:t>
       </w:r>
     </w:p>
     <w:p>
@@ -631,7 +631,7 @@
           <w:rFonts w:ascii="Arial" w:hAnsi="Arial" w:eastAsia="Arial"/>
           <w:sz w:val="21"/>
         </w:rPr>
-        <w:t xml:space="preserve">The data service reads the order data from Snowflake, applies the agreed business rules, and sends back the results to be drawn as charts and tables.</w:t>
+        <w:t>4. The data service reads the Gold data tables using a secure token, applies the agreed business rules, and sends back the results to be drawn as charts and tables.</w:t>
       </w:r>
     </w:p>
     <w:p>
@@ -722,7 +722,7 @@
           <w:rFonts w:ascii="Arial" w:hAnsi="Arial" w:eastAsia="Arial"/>
           <w:sz w:val="21"/>
         </w:rPr>
-        <w:t xml:space="preserve">Data coverage: about 30,000 orders from 400 customers across 15 products, dated 1 January to 31 December 2022.</w:t>
+        <w:t xml:space="preserve">Data coverage: about 30,000 orders from 400 customers across 15 products, dated 1 January to 31 December 2022 (current sample dataset, US-only). The live Snowflake dataset spans multiple countries.</w:t>
       </w:r>
     </w:p>
     <w:p>
@@ -1043,350 +1043,7 @@
           <w:color w:val="1C4EF5"/>
           <w:sz w:val="32"/>
         </w:rPr>
-        <w:t xml:space="preserve">7. Assumptions, Risks and Open Questions</w:t>
-      </w:r>
-    </w:p>
-    <w:tbl>
-      <w:tblPr>
-        <w:tblW w:w="5000" w:type="pct"/>
-        <w:tblBorders>
-          <w:top w:val="single" w:sz="4"/>
-          <w:left w:val="single" w:sz="4"/>
-          <w:bottom w:val="single" w:sz="4"/>
-          <w:right w:val="single" w:sz="4"/>
-          <w:insideH w:val="single" w:sz="4"/>
-          <w:insideV w:val="single" w:sz="4"/>
-        </w:tblBorders>
-      </w:tblPr>
-      <w:tblGrid>
-        <w:gridCol w:w="1900"/>
-        <w:gridCol w:w="7738"/>
-      </w:tblGrid>
-      <w:tr>
-        <w:trPr>
-          <w:tblHeader/>
-        </w:trPr>
-        <w:tc>
-          <w:tcPr>
-            <w:tcW w:w="1900" w:type="dxa"/>
-            <w:shd w:val="clear" w:fill="1C4EF5"/>
-          </w:tcPr>
-          <w:p>
-            <w:r>
-              <w:rPr>
-                <w:rFonts w:ascii="Arial" w:hAnsi="Arial" w:eastAsia="Arial"/>
-                <w:b/>
-                <w:color w:val="FFFFFF"/>
-                <w:sz w:val="20"/>
-              </w:rPr>
-              <w:t xml:space="preserve">Item</w:t>
-            </w:r>
-          </w:p>
-        </w:tc>
-        <w:tc>
-          <w:tcPr>
-            <w:tcW w:w="7738" w:type="dxa"/>
-            <w:shd w:val="clear" w:fill="1C4EF5"/>
-          </w:tcPr>
-          <w:p>
-            <w:r>
-              <w:rPr>
-                <w:rFonts w:ascii="Arial" w:hAnsi="Arial" w:eastAsia="Arial"/>
-                <w:b/>
-                <w:color w:val="FFFFFF"/>
-                <w:sz w:val="20"/>
-              </w:rPr>
-              <w:t xml:space="preserve">Detail</w:t>
-            </w:r>
-          </w:p>
-        </w:tc>
-      </w:tr>
-      <w:tr>
-        <w:trPr/>
-        <w:tc>
-          <w:tcPr>
-            <w:tcW w:w="1900" w:type="dxa"/>
-          </w:tcPr>
-          <w:p>
-            <w:r>
-              <w:rPr>
-                <w:rFonts w:ascii="Arial" w:hAnsi="Arial" w:eastAsia="Arial"/>
-                <w:b/>
-                <w:sz w:val="20"/>
-              </w:rPr>
-              <w:t xml:space="preserve">Assumption</w:t>
-            </w:r>
-          </w:p>
-        </w:tc>
-        <w:tc>
-          <w:tcPr>
-            <w:tcW w:w="7738" w:type="dxa"/>
-          </w:tcPr>
-          <w:p>
-            <w:r>
-              <w:rPr>
-                <w:rFonts w:ascii="Arial" w:hAnsi="Arial" w:eastAsia="Arial"/>
-                <w:sz w:val="20"/>
-              </w:rPr>
-              <w:t xml:space="preserve">The data is a static 2022 snapshot, so "latest" means the end of 2022.</w:t>
-            </w:r>
-          </w:p>
-        </w:tc>
-      </w:tr>
-      <w:tr>
-        <w:trPr/>
-        <w:tc>
-          <w:tcPr>
-            <w:tcW w:w="1900" w:type="dxa"/>
-          </w:tcPr>
-          <w:p>
-            <w:r>
-              <w:rPr>
-                <w:rFonts w:ascii="Arial" w:hAnsi="Arial" w:eastAsia="Arial"/>
-                <w:b/>
-                <w:sz w:val="20"/>
-              </w:rPr>
-              <w:t xml:space="preserve">Assumption</w:t>
-            </w:r>
-          </w:p>
-        </w:tc>
-        <w:tc>
-          <w:tcPr>
-            <w:tcW w:w="7738" w:type="dxa"/>
-          </w:tcPr>
-          <w:p>
-            <w:r>
-              <w:rPr>
-                <w:rFonts w:ascii="Arial" w:hAnsi="Arial" w:eastAsia="Arial"/>
-                <w:sz w:val="20"/>
-              </w:rPr>
-              <w:t xml:space="preserve">Data is shown by US city and state because it holds no country field.</w:t>
-            </w:r>
-          </w:p>
-        </w:tc>
-      </w:tr>
-      <w:tr>
-        <w:trPr/>
-        <w:tc>
-          <w:tcPr>
-            <w:tcW w:w="1900" w:type="dxa"/>
-          </w:tcPr>
-          <w:p>
-            <w:r>
-              <w:rPr>
-                <w:rFonts w:ascii="Arial" w:hAnsi="Arial" w:eastAsia="Arial"/>
-                <w:b/>
-                <w:sz w:val="20"/>
-              </w:rPr>
-              <w:t xml:space="preserve">Risk</w:t>
-            </w:r>
-          </w:p>
-        </w:tc>
-        <w:tc>
-          <w:tcPr>
-            <w:tcW w:w="7738" w:type="dxa"/>
-          </w:tcPr>
-          <w:p>
-            <w:r>
-              <w:rPr>
-                <w:rFonts w:ascii="Arial" w:hAnsi="Arial" w:eastAsia="Arial"/>
-                <w:sz w:val="20"/>
-              </w:rPr>
-              <w:t xml:space="preserve">Services in Snowflake are created by the NovaCart facilitator, so any delay there affects the deployment date.</w:t>
-            </w:r>
-          </w:p>
-        </w:tc>
-      </w:tr>
-      <w:tr>
-        <w:trPr/>
-        <w:tc>
-          <w:tcPr>
-            <w:tcW w:w="1900" w:type="dxa"/>
-          </w:tcPr>
-          <w:p>
-            <w:r>
-              <w:rPr>
-                <w:rFonts w:ascii="Arial" w:hAnsi="Arial" w:eastAsia="Arial"/>
-                <w:b/>
-                <w:sz w:val="20"/>
-              </w:rPr>
-              <w:t xml:space="preserve">Open question</w:t>
-            </w:r>
-          </w:p>
-        </w:tc>
-        <w:tc>
-          <w:tcPr>
-            <w:tcW w:w="7738" w:type="dxa"/>
-          </w:tcPr>
-          <w:p>
-            <w:r>
-              <w:rPr>
-                <w:rFonts w:ascii="Arial" w:hAnsi="Arial" w:eastAsia="Arial"/>
-                <w:sz w:val="20"/>
-              </w:rPr>
-              <w:t xml:space="preserve">What date range should the dashboard open on?</w:t>
-            </w:r>
-          </w:p>
-        </w:tc>
-      </w:tr>
-      <w:tr>
-        <w:trPr/>
-        <w:tc>
-          <w:tcPr>
-            <w:tcW w:w="1900" w:type="dxa"/>
-          </w:tcPr>
-          <w:p>
-            <w:r>
-              <w:rPr>
-                <w:rFonts w:ascii="Arial" w:hAnsi="Arial" w:eastAsia="Arial"/>
-                <w:b/>
-                <w:sz w:val="20"/>
-              </w:rPr>
-              <w:t xml:space="preserve">Open question</w:t>
-            </w:r>
-          </w:p>
-        </w:tc>
-        <w:tc>
-          <w:tcPr>
-            <w:tcW w:w="7738" w:type="dxa"/>
-          </w:tcPr>
-          <w:p>
-            <w:r>
-              <w:rPr>
-                <w:rFonts w:ascii="Arial" w:hAnsi="Arial" w:eastAsia="Arial"/>
-                <w:sz w:val="20"/>
-              </w:rPr>
-              <w:t xml:space="preserve">What does "franchise" mean for NovaCart, and who will sign in?</w:t>
-            </w:r>
-          </w:p>
-        </w:tc>
-      </w:tr>
-      <w:tr>
-        <w:trPr/>
-        <w:tc>
-          <w:tcPr>
-            <w:tcW w:w="1900" w:type="dxa"/>
-          </w:tcPr>
-          <w:p>
-            <w:r>
-              <w:rPr>
-                <w:rFonts w:ascii="Arial" w:hAnsi="Arial" w:eastAsia="Arial"/>
-                <w:b/>
-                <w:sz w:val="20"/>
-              </w:rPr>
-              <w:t xml:space="preserve">Open question</w:t>
-            </w:r>
-          </w:p>
-        </w:tc>
-        <w:tc>
-          <w:tcPr>
-            <w:tcW w:w="7738" w:type="dxa"/>
-          </w:tcPr>
-          <w:p>
-            <w:r>
-              <w:rPr>
-                <w:rFonts w:ascii="Arial" w:hAnsi="Arial" w:eastAsia="Arial"/>
-                <w:sz w:val="20"/>
-              </w:rPr>
-              <w:t xml:space="preserve">What should a manager see first when they open the dashboard?</w:t>
-            </w:r>
-          </w:p>
-        </w:tc>
-      </w:tr>
-      <w:tr>
-        <w:trPr/>
-        <w:tc>
-          <w:tcPr>
-            <w:tcW w:w="1900" w:type="dxa"/>
-          </w:tcPr>
-          <w:p>
-            <w:r>
-              <w:rPr>
-                <w:rFonts w:ascii="Arial" w:hAnsi="Arial" w:eastAsia="Arial"/>
-                <w:b/>
-                <w:sz w:val="20"/>
-              </w:rPr>
-              <w:t xml:space="preserve">Open question</w:t>
-            </w:r>
-          </w:p>
-        </w:tc>
-        <w:tc>
-          <w:tcPr>
-            <w:tcW w:w="7738" w:type="dxa"/>
-          </w:tcPr>
-          <w:p>
-            <w:r>
-              <w:rPr>
-                <w:rFonts w:ascii="Arial" w:hAnsi="Arial" w:eastAsia="Arial"/>
-                <w:sz w:val="20"/>
-              </w:rPr>
-              <w:t xml:space="preserve">Is city and state an acceptable replacement for country?</w:t>
-            </w:r>
-          </w:p>
-        </w:tc>
-      </w:tr>
-    </w:tbl>
-    <w:p>
-      <w:pPr>
-        <w:pStyle w:val="Heading1"/>
-        <w:spacing w:before="280" w:after="80"/>
-      </w:pPr>
-      <w:r>
-        <w:rPr>
-          <w:rFonts w:ascii="Arial" w:hAnsi="Arial" w:eastAsia="Arial"/>
-          <w:b/>
-          <w:color w:val="1C4EF5"/>
-          <w:sz w:val="32"/>
-        </w:rPr>
-        <w:t xml:space="preserve">8. Recommended Next Steps for NovaCart</w:t>
-      </w:r>
-    </w:p>
-    <w:p>
-      <w:pPr>
-        <w:numPr>
-          <w:ilvl w:val="0"/>
-          <w:numId w:val="4"/>
-        </w:numPr>
-        <w:spacing w:after="40"/>
-      </w:pPr>
-      <w:r>
-        <w:rPr>
-          <w:rFonts w:ascii="Arial" w:hAnsi="Arial" w:eastAsia="Arial"/>
-          <w:sz w:val="21"/>
-        </w:rPr>
-        <w:t xml:space="preserve">Connect live data so the dashboard shows current orders instead of a 2022 snapshot.</w:t>
-      </w:r>
-    </w:p>
-    <w:p>
-      <w:pPr>
-        <w:numPr>
-          <w:ilvl w:val="0"/>
-          <w:numId w:val="4"/>
-        </w:numPr>
-        <w:spacing w:after="40"/>
-      </w:pPr>
-      <w:r>
-        <w:rPr>
-          <w:rFonts w:ascii="Arial" w:hAnsi="Arial" w:eastAsia="Arial"/>
-          <w:sz w:val="21"/>
-        </w:rPr>
-        <w:t xml:space="preserve">Add roles so each account manager sees only their own accounts.</w:t>
-      </w:r>
-    </w:p>
-    <w:p>
-      <w:pPr>
-        <w:numPr>
-          <w:ilvl w:val="0"/>
-          <w:numId w:val="4"/>
-        </w:numPr>
-        <w:spacing w:after="40"/>
-      </w:pPr>
-      <w:r>
-        <w:rPr>
-          <w:rFonts w:ascii="Arial" w:hAnsi="Arial" w:eastAsia="Arial"/>
-          <w:sz w:val="21"/>
-        </w:rPr>
-        <w:t xml:space="preserve">Add customer detail pages showing a single customer's order history.</w:t>
+        <w:t xml:space="preserve">7. Recommended Next Steps for NovaCart</w:t>
       </w:r>
     </w:p>
     <w:p>
@@ -1403,6 +1060,22 @@
           <w:sz w:val="21"/>
         </w:rPr>
         <w:t xml:space="preserve">Export to Excel or CSV to bridge the move away from the weekly spreadsheet.</w:t>
+      </w:r>
+    </w:p>
+    <w:p>
+      <w:pPr>
+        <w:numPr>
+          <w:ilvl w:val="0"/>
+          <w:numId w:val="4"/>
+        </w:numPr>
+        <w:spacing w:after="120"/>
+      </w:pPr>
+      <w:r>
+        <w:rPr>
+          <w:rFonts w:ascii="Arial" w:hAnsi="Arial" w:eastAsia="Arial"/>
+          <w:sz w:val="21"/>
+        </w:rPr>
+        <w:t xml:space="preserve">Explore an AI chatbot for self-service questions and ongoing support — the client confirmed this is an acceptable direction.</w:t>
       </w:r>
     </w:p>
     <w:sectPr>
@@ -1427,7 +1100,7 @@
         <w:color w:val="57606A"/>
         <w:sz w:val="18"/>
       </w:rPr>
-      <w:t xml:space="preserve">Prepared for Indigo BioMed  |  NovaCart Account Dashboard  |  Team 26  |  Draft v0.1</w:t>
+      <w:t xml:space="preserve">Prepared for Indigo BioMed  |  NovaCart Account Dashboard  |  Team 26  |  Draft v0.2</w:t>
     </w:r>
   </w:p>
 </w:ftr>

</xml_diff>